<commit_message>
docs(gost): rebuild for the PR branch (541 files incl. suspects), neutral wording, no tool-specific mentions
</commit_message>
<xml_diff>
--- a/docs/gost/02-poyasnitelnaya-zapiska.docx
+++ b/docs/gost/02-poyasnitelnaya-zapiska.docx
@@ -3511,38 +3511,47 @@
         </w:numPr>
       </w:pPr>
       <w:r>
-        <w:t xml:space="preserve">Угадывание виновного (матрица подозреваемых, ветка </w:t>
-      </w:r>
-      <w:r>
-        <w:rPr>
-          <w:rFonts w:ascii="Courier New" w:hAnsi="Courier New" w:cs="Courier New"/>
-          <w:sz w:val="24"/>
-          <w:szCs w:val="24"/>
-        </w:rPr>
-        <w:t xml:space="preserve">feat/suspects-matrix</w:t>
-      </w:r>
-      <w:r>
-        <w:t xml:space="preserve">, в </w:t>
-      </w:r>
-      <w:r>
-        <w:rPr>
-          <w:rFonts w:ascii="Courier New" w:hAnsi="Courier New" w:cs="Courier New"/>
-          <w:sz w:val="24"/>
-          <w:szCs w:val="24"/>
-        </w:rPr>
-        <w:t xml:space="preserve">main</w:t>
-      </w:r>
-      <w:r>
-        <w:t xml:space="preserve"> на дату составления её нет; отчёты </w:t>
-      </w:r>
-      <w:r>
-        <w:rPr>
-          <w:rFonts w:ascii="Courier New" w:hAnsi="Courier New" w:cs="Courier New"/>
-          <w:sz w:val="24"/>
-          <w:szCs w:val="24"/>
-        </w:rPr>
-        <w:t xml:space="preserve">docs/spike/results/suspects-20261030.md</w:t>
-      </w:r>
+        <w:t xml:space="preserve">Угадывание виновного (матрица подозреваемых, экспериментальный код </w:t>
+      </w:r>
+      <w:hyperlink r:id="rIdLnk15" w:history="1">
+        <w:r>
+          <w:rPr>
+            <w:rStyle w:val="Hyperlink"/>
+            <w:rFonts w:ascii="Courier New" w:hAnsi="Courier New" w:cs="Courier New"/>
+            <w:sz w:val="24"/>
+            <w:szCs w:val="24"/>
+          </w:rPr>
+          <w:t xml:space="preserve">src/detective_board/suspects/</w:t>
+        </w:r>
+      </w:hyperlink>
+      <w:r>
+        <w:t xml:space="preserve">, </w:t>
+      </w:r>
+      <w:hyperlink r:id="rIdLnk16" w:history="1">
+        <w:r>
+          <w:rPr>
+            <w:rStyle w:val="Hyperlink"/>
+            <w:rFonts w:ascii="Courier New" w:hAnsi="Courier New" w:cs="Courier New"/>
+            <w:sz w:val="24"/>
+            <w:szCs w:val="24"/>
+          </w:rPr>
+          <w:t xml:space="preserve">eval/suspects/</w:t>
+        </w:r>
+      </w:hyperlink>
+      <w:r>
+        <w:t xml:space="preserve">; отчёты </w:t>
+      </w:r>
+      <w:hyperlink r:id="rIdLnk17" w:history="1">
+        <w:r>
+          <w:rPr>
+            <w:rStyle w:val="Hyperlink"/>
+            <w:rFonts w:ascii="Courier New" w:hAnsi="Courier New" w:cs="Courier New"/>
+            <w:sz w:val="24"/>
+            <w:szCs w:val="24"/>
+          </w:rPr>
+          <w:t xml:space="preserve">docs/spike/results/suspects-20261030.md</w:t>
+        </w:r>
+      </w:hyperlink>
       <w:r>
         <w:t xml:space="preserve"> и </w:t>
       </w:r>
@@ -3555,7 +3564,7 @@
         <w:t xml:space="preserve">suspects-prereg-heldout-20261030.md</w:t>
       </w:r>
       <w:r>
-        <w:t xml:space="preserve"> лежат на этой ветке). Тестовый срез основного корпуса (8 рассказов, замороженный протокол, один прогон): ни один метод не превзошёл простые базовые приёмы. Dev (8 рассказов) – исследовательский: лучший из примерно 35 вариантов, парный турнир на qwen3:14b, назвал виновного первым в 4 случаях из 8; цифра завышена, так как метод отбирался на этих же рассказах. На 6 новых рассказах (Честертон, «Father Brown», протокол заморожен до прогона, один запуск) тот же метод назвал виновного первым в 2 случаях из 6 – как и базовая «самый упоминаемый» (2 из 6); интервал Уилсона 0,10–0,70; один оправданный назван первым. Метки (виновный, оправданные, место обрезки текста) расставил ИИ, нужна проверка человеком. Вывод: система не угадывает развязку надёжно; «не обвиняет невиновного» выполняется лишь ценой отказов отвечать.</w:t>
+        <w:t xml:space="preserve">). Тестовый срез основного корпуса (8 рассказов, замороженный протокол, один прогон): ни один метод не превзошёл простые базовые приёмы. Dev (8 рассказов) – исследовательский: лучший из примерно 35 вариантов, парный турнир на qwen3:14b, назвал виновного первым в 4 случаях из 8; цифра завышена, так как метод отбирался на этих же рассказах. На 6 новых рассказах (Честертон, «Father Brown», протокол заморожен до прогона, один запуск) тот же метод назвал виновного первым в 2 случаях из 6 – как и базовая «самый упоминаемый» (2 из 6); интервал Уилсона 0,10–0,70; один оправданный назван первым. Метки (виновный, оправданные, место обрезки текста) расставил ИИ, нужна проверка человеком. Вывод: система не угадывает развязку надёжно; «не обвиняет невиновного» выполняется лишь ценой отказов отвечать.</w:t>
       </w:r>
     </w:p>
     <w:p>
@@ -3569,7 +3578,7 @@
       <w:r>
         <w:t xml:space="preserve">Тест «до раскрытия» (</w:t>
       </w:r>
-      <w:hyperlink r:id="rIdLnk15" w:history="1">
+      <w:hyperlink r:id="rIdLnk18" w:history="1">
         <w:r>
           <w:rPr>
             <w:rStyle w:val="Hyperlink"/>
@@ -3583,7 +3592,7 @@
       <w:r>
         <w:t xml:space="preserve">, 16 вопросов, 8 рассказов): виновник назван 2/16 при полном корпусе, 0/16 при корпусе, обрезанном перед раскрытием, 1/16 у голой модели; различия статистически не значимы (</w:t>
       </w:r>
-      <w:hyperlink r:id="rIdLnk16" w:history="1">
+      <w:hyperlink r:id="rIdLnk19" w:history="1">
         <w:r>
           <w:rPr>
             <w:rStyle w:val="Hyperlink"/>
@@ -3620,7 +3629,7 @@
       <w:r>
         <w:t xml:space="preserve">, по умолчанию выключен): на dev строгая полнота 1/14, ложных срабатываний на контролях 8/9 (</w:t>
       </w:r>
-      <w:hyperlink r:id="rIdLnk17" w:history="1">
+      <w:hyperlink r:id="rIdLnk20" w:history="1">
         <w:r>
           <w:rPr>
             <w:rStyle w:val="Hyperlink"/>
@@ -3657,7 +3666,7 @@
       <w:r>
         <w:t xml:space="preserve"> (выбор сущности) признан небезопасным (</w:t>
       </w:r>
-      <w:hyperlink r:id="rIdLnk18" w:history="1">
+      <w:hyperlink r:id="rIdLnk21" w:history="1">
         <w:r>
           <w:rPr>
             <w:rStyle w:val="Hyperlink"/>
@@ -3669,18 +3678,7 @@
         </w:r>
       </w:hyperlink>
       <w:r>
-        <w:t xml:space="preserve">); он не слит. Код ветки </w:t>
-      </w:r>
-      <w:r>
-        <w:rPr>
-          <w:rFonts w:ascii="Courier New" w:hAnsi="Courier New" w:cs="Courier New"/>
-          <w:sz w:val="24"/>
-          <w:szCs w:val="24"/>
-        </w:rPr>
-        <w:t xml:space="preserve">feat/suspects-matrix</w:t>
-      </w:r>
-      <w:r>
-        <w:t xml:space="preserve"> в настоящую документацию не входит, использованы только её отчёты.</w:t>
+        <w:t xml:space="preserve">); он не слит.</w:t>
       </w:r>
     </w:p>
     <w:p>
@@ -3695,7 +3693,7 @@
       <w:r>
         <w:t xml:space="preserve">Решения зафиксированы в ADR (</w:t>
       </w:r>
-      <w:hyperlink r:id="rIdLnk19" w:history="1">
+      <w:hyperlink r:id="rIdLnk22" w:history="1">
         <w:r>
           <w:rPr>
             <w:rStyle w:val="Hyperlink"/>
@@ -4947,7 +4945,7 @@
       <w:r>
         <w:t xml:space="preserve"> фактах (</w:t>
       </w:r>
-      <w:hyperlink r:id="rIdLnk20" w:history="1">
+      <w:hyperlink r:id="rIdLnk23" w:history="1">
         <w:r>
           <w:rPr>
             <w:rStyle w:val="Hyperlink"/>
@@ -4972,7 +4970,7 @@
       <w:r>
         <w:t xml:space="preserve">. Показывают, что делают правила на верных фактах, а не что находит модель (</w:t>
       </w:r>
-      <w:hyperlink r:id="rIdLnk21" w:history="1">
+      <w:hyperlink r:id="rIdLnk24" w:history="1">
         <w:r>
           <w:rPr>
             <w:rStyle w:val="Hyperlink"/>
@@ -4998,7 +4996,7 @@
       <w:r>
         <w:t xml:space="preserve">Цитата проверяется на дословное вхождение в цитируемый фрагмент, но не на то, что она поддерживает утверждение (</w:t>
       </w:r>
-      <w:hyperlink r:id="rIdLnk22" w:history="1">
+      <w:hyperlink r:id="rIdLnk25" w:history="1">
         <w:r>
           <w:rPr>
             <w:rStyle w:val="Hyperlink"/>
@@ -5036,7 +5034,7 @@
       <w:r>
         <w:t xml:space="preserve">Вычисления на GPU-сервере: извлечение графа, проход присутствия, часть оценок; на показе их нет. Разрешение организаторов – по сообщению руководителя команды от 26.10.2026; письменный ответ к раскрытию не приложен (</w:t>
       </w:r>
-      <w:hyperlink r:id="rIdLnk23" w:history="1">
+      <w:hyperlink r:id="rIdLnk26" w:history="1">
         <w:r>
           <w:rPr>
             <w:rStyle w:val="Hyperlink"/>
@@ -5063,7 +5061,7 @@
       <w:r>
         <w:t xml:space="preserve">Обзор безопасности выполнен 23.10.2026 (</w:t>
       </w:r>
-      <w:hyperlink r:id="rIdLnk24" w:history="1">
+      <w:hyperlink r:id="rIdLnk27" w:history="1">
         <w:r>
           <w:rPr>
             <w:rStyle w:val="Hyperlink"/>
@@ -5077,7 +5075,7 @@
       <w:r>
         <w:t xml:space="preserve">), по коду без запуска моделей. Выводы по группам угроз: внедрение инструкций из корпуса – модель не выбирает маршрут и аргументы инструментов (код), корпус передаётся в ограждённых блоках; найдены проблемы средней важности – неограждённые поля в запросе и проверка цитат только на дословность. Песочница чтения файлов MCP – в порядке; серверы filesystem/fetch не подключены. API: привязка к loopback, проверка Host и Origin, заголовки CSP и X-Frame-Options. SQL-инъекции, pickle/eval – не выявлены. Таблица статусов в отчёте содержит пометки «исправлено, не закоммичено» на момент обзора; актуальное состояние исправлений нужно проверять по коду и тестам (</w:t>
       </w:r>
-      <w:hyperlink r:id="rIdLnk25" w:history="1">
+      <w:hyperlink r:id="rIdLnk28" w:history="1">
         <w:r>
           <w:rPr>
             <w:rStyle w:val="Hyperlink"/>
@@ -5091,7 +5089,7 @@
       <w:r>
         <w:t xml:space="preserve">, </w:t>
       </w:r>
-      <w:hyperlink r:id="rIdLnk26" w:history="1">
+      <w:hyperlink r:id="rIdLnk29" w:history="1">
         <w:r>
           <w:rPr>
             <w:rStyle w:val="Hyperlink"/>
@@ -5105,7 +5103,7 @@
       <w:r>
         <w:t xml:space="preserve">, </w:t>
       </w:r>
-      <w:hyperlink r:id="rIdLnk27" w:history="1">
+      <w:hyperlink r:id="rIdLnk30" w:history="1">
         <w:r>
           <w:rPr>
             <w:rStyle w:val="Hyperlink"/>
@@ -5139,7 +5137,7 @@
       <w:r>
         <w:t xml:space="preserve">Чистая установка из офлайн-архива на двух разных ноутбуках (issue #8): проверена одна машина (</w:t>
       </w:r>
-      <w:hyperlink r:id="rIdLnk28" w:history="1">
+      <w:hyperlink r:id="rIdLnk31" w:history="1">
         <w:r>
           <w:rPr>
             <w:rStyle w:val="Hyperlink"/>

</xml_diff>